<commit_message>
SP reports, OS report
</commit_message>
<xml_diff>
--- a/BSUIR/semestre 5/IAD/Сушко_381574_ИАД_ЛР1.docx
+++ b/BSUIR/semestre 5/IAD/Сушко_381574_ИАД_ЛР1.docx
@@ -526,7 +526,23 @@
                 <w:rFonts w:cs="Times New Roman"/>
                 <w:szCs w:val="28"/>
               </w:rPr>
-              <w:t xml:space="preserve">оцент кафедры ИСиТ, </w:t>
+              <w:t xml:space="preserve">оцент кафедры </w:t>
+            </w:r>
+            <w:proofErr w:type="spellStart"/>
+            <w:r>
+              <w:rPr>
+                <w:rFonts w:cs="Times New Roman"/>
+                <w:szCs w:val="28"/>
+              </w:rPr>
+              <w:t>ИСиТ</w:t>
+            </w:r>
+            <w:proofErr w:type="spellEnd"/>
+            <w:r>
+              <w:rPr>
+                <w:rFonts w:cs="Times New Roman"/>
+                <w:szCs w:val="28"/>
+              </w:rPr>
+              <w:t xml:space="preserve">, </w:t>
             </w:r>
           </w:p>
           <w:p>
@@ -792,7 +808,67 @@
           <w:szCs w:val="28"/>
           <w:lang w:eastAsia="ru-RU"/>
         </w:rPr>
-        <w:t>Изучить возможности программного обеспечения Orange Data Mining. Освоить основные методики загрузки данных из внешних источников, очистки и подготовки их для дальнейшего анализа. Научиться создавать базовые визуализации для анализа качества данных.</w:t>
+        <w:t xml:space="preserve">Изучить возможности программного обеспечения </w:t>
+      </w:r>
+      <w:proofErr w:type="spellStart"/>
+      <w:r>
+        <w:rPr>
+          <w:rFonts w:eastAsia="Times New Roman" w:cs="Times New Roman"/>
+          <w:color w:val="000000"/>
+          <w:szCs w:val="28"/>
+          <w:lang w:eastAsia="ru-RU"/>
+        </w:rPr>
+        <w:t>Orange</w:t>
+      </w:r>
+      <w:proofErr w:type="spellEnd"/>
+      <w:r>
+        <w:rPr>
+          <w:rFonts w:eastAsia="Times New Roman" w:cs="Times New Roman"/>
+          <w:color w:val="000000"/>
+          <w:szCs w:val="28"/>
+          <w:lang w:eastAsia="ru-RU"/>
+        </w:rPr>
+        <w:t xml:space="preserve"> </w:t>
+      </w:r>
+      <w:proofErr w:type="spellStart"/>
+      <w:r>
+        <w:rPr>
+          <w:rFonts w:eastAsia="Times New Roman" w:cs="Times New Roman"/>
+          <w:color w:val="000000"/>
+          <w:szCs w:val="28"/>
+          <w:lang w:eastAsia="ru-RU"/>
+        </w:rPr>
+        <w:t>Data</w:t>
+      </w:r>
+      <w:proofErr w:type="spellEnd"/>
+      <w:r>
+        <w:rPr>
+          <w:rFonts w:eastAsia="Times New Roman" w:cs="Times New Roman"/>
+          <w:color w:val="000000"/>
+          <w:szCs w:val="28"/>
+          <w:lang w:eastAsia="ru-RU"/>
+        </w:rPr>
+        <w:t xml:space="preserve"> </w:t>
+      </w:r>
+      <w:proofErr w:type="spellStart"/>
+      <w:r>
+        <w:rPr>
+          <w:rFonts w:eastAsia="Times New Roman" w:cs="Times New Roman"/>
+          <w:color w:val="000000"/>
+          <w:szCs w:val="28"/>
+          <w:lang w:eastAsia="ru-RU"/>
+        </w:rPr>
+        <w:t>Mining</w:t>
+      </w:r>
+      <w:proofErr w:type="spellEnd"/>
+      <w:r>
+        <w:rPr>
+          <w:rFonts w:eastAsia="Times New Roman" w:cs="Times New Roman"/>
+          <w:color w:val="000000"/>
+          <w:szCs w:val="28"/>
+          <w:lang w:eastAsia="ru-RU"/>
+        </w:rPr>
+        <w:t>. Освоить основные методики загрузки данных из внешних источников, очистки и подготовки их для дальнейшего анализа. Научиться создавать базовые визуализации для анализа качества данных.</w:t>
       </w:r>
       <w:r>
         <w:rPr>
@@ -917,7 +993,25 @@
           <w:szCs w:val="20"/>
           <w:shd w:val="clear" w:color="auto" w:fill="FFFFFF"/>
         </w:rPr>
-        <w:t>программного обеспечения Orange 3.39.0.</w:t>
+        <w:t xml:space="preserve">программного обеспечения </w:t>
+      </w:r>
+      <w:proofErr w:type="spellStart"/>
+      <w:r>
+        <w:rPr>
+          <w:color w:val="000000"/>
+          <w:szCs w:val="20"/>
+          <w:shd w:val="clear" w:color="auto" w:fill="FFFFFF"/>
+        </w:rPr>
+        <w:t>Orange</w:t>
+      </w:r>
+      <w:proofErr w:type="spellEnd"/>
+      <w:r>
+        <w:rPr>
+          <w:color w:val="000000"/>
+          <w:szCs w:val="20"/>
+          <w:shd w:val="clear" w:color="auto" w:fill="FFFFFF"/>
+        </w:rPr>
+        <w:t xml:space="preserve"> 3.39.0.</w:t>
       </w:r>
     </w:p>
     <w:p>
@@ -2733,7 +2827,27 @@
           <w:szCs w:val="28"/>
           <w:lang w:eastAsia="ru-RU"/>
         </w:rPr>
-        <w:t xml:space="preserve">В моем датасете все даты хранятся в формате </w:t>
+        <w:t xml:space="preserve">В моем </w:t>
+      </w:r>
+      <w:proofErr w:type="spellStart"/>
+      <w:r>
+        <w:rPr>
+          <w:rFonts w:eastAsia="Times New Roman" w:cs="Times New Roman"/>
+          <w:color w:val="000000"/>
+          <w:szCs w:val="28"/>
+          <w:lang w:eastAsia="ru-RU"/>
+        </w:rPr>
+        <w:t>датасете</w:t>
+      </w:r>
+      <w:proofErr w:type="spellEnd"/>
+      <w:r>
+        <w:rPr>
+          <w:rFonts w:eastAsia="Times New Roman" w:cs="Times New Roman"/>
+          <w:color w:val="000000"/>
+          <w:szCs w:val="28"/>
+          <w:lang w:eastAsia="ru-RU"/>
+        </w:rPr>
+        <w:t xml:space="preserve"> все даты хранятся в формате </w:t>
       </w:r>
       <w:r>
         <w:rPr>
@@ -3137,6 +3251,7 @@
       <w:r>
         <w:rPr>
           <w:rFonts w:eastAsia="Times New Roman" w:cs="Times New Roman"/>
+          <w:noProof/>
           <w:color w:val="000000"/>
           <w:szCs w:val="28"/>
           <w:lang w:eastAsia="ru-RU"/>
@@ -3205,6 +3320,7 @@
       <w:r>
         <w:rPr>
           <w:rFonts w:eastAsia="Times New Roman" w:cs="Times New Roman"/>
+          <w:noProof/>
           <w:color w:val="000000"/>
           <w:szCs w:val="28"/>
           <w:lang w:eastAsia="ru-RU"/>
@@ -3415,6 +3531,7 @@
       <w:r>
         <w:rPr>
           <w:rFonts w:eastAsia="Times New Roman" w:cs="Times New Roman"/>
+          <w:noProof/>
           <w:color w:val="000000"/>
           <w:szCs w:val="28"/>
           <w:lang w:val="en-US" w:eastAsia="ru-RU"/>
@@ -3634,6 +3751,7 @@
       <w:r>
         <w:rPr>
           <w:rFonts w:eastAsia="Times New Roman" w:cs="Times New Roman"/>
+          <w:noProof/>
           <w:color w:val="000000"/>
           <w:szCs w:val="28"/>
           <w:lang w:val="en-US" w:eastAsia="ru-RU"/>
@@ -3738,6 +3856,7 @@
       <w:r>
         <w:rPr>
           <w:rFonts w:eastAsia="Times New Roman" w:cs="Times New Roman"/>
+          <w:noProof/>
           <w:color w:val="000000"/>
           <w:szCs w:val="28"/>
           <w:lang w:eastAsia="ru-RU"/>
@@ -3794,6 +3913,7 @@
       <w:r>
         <w:rPr>
           <w:rFonts w:eastAsia="Times New Roman" w:cs="Times New Roman"/>
+          <w:noProof/>
           <w:color w:val="000000"/>
           <w:szCs w:val="28"/>
           <w:lang w:eastAsia="ru-RU"/>
@@ -3886,6 +4006,7 @@
       <w:r>
         <w:rPr>
           <w:rFonts w:eastAsia="Times New Roman" w:cs="Times New Roman"/>
+          <w:noProof/>
           <w:color w:val="000000"/>
           <w:szCs w:val="28"/>
           <w:lang w:eastAsia="ru-RU"/>
@@ -3927,47 +4048,22 @@
           </wp:inline>
         </w:drawing>
       </w:r>
+    </w:p>
+    <w:p>
+      <w:pPr>
+        <w:ind w:left="709"/>
+        <w:jc w:val="both"/>
+        <w:rPr>
+          <w:rFonts w:eastAsia="Times New Roman" w:cs="Times New Roman"/>
+          <w:b/>
+          <w:bCs/>
+          <w:color w:val="000000"/>
+          <w:szCs w:val="28"/>
+          <w:lang w:eastAsia="ru-RU"/>
+        </w:rPr>
+      </w:pPr>
       <w:bookmarkStart w:id="0" w:name="_GoBack"/>
       <w:bookmarkEnd w:id="0"/>
-    </w:p>
-    <w:p>
-      <w:pPr>
-        <w:ind w:left="709"/>
-        <w:jc w:val="both"/>
-        <w:rPr>
-          <w:rFonts w:eastAsia="Times New Roman" w:cs="Times New Roman"/>
-          <w:b/>
-          <w:bCs/>
-          <w:color w:val="000000"/>
-          <w:szCs w:val="28"/>
-          <w:lang w:eastAsia="ru-RU"/>
-        </w:rPr>
-      </w:pPr>
-      <w:r>
-        <w:rPr>
-          <w:rFonts w:eastAsia="Times New Roman" w:cs="Times New Roman"/>
-          <w:b/>
-          <w:bCs/>
-          <w:color w:val="000000"/>
-          <w:szCs w:val="28"/>
-          <w:lang w:eastAsia="ru-RU"/>
-        </w:rPr>
-        <w:t>Задание 10. Анализ и выводы</w:t>
-      </w:r>
-    </w:p>
-    <w:p>
-      <w:pPr>
-        <w:ind w:left="709"/>
-        <w:jc w:val="both"/>
-        <w:rPr>
-          <w:rFonts w:eastAsia="Times New Roman" w:cs="Times New Roman"/>
-          <w:b/>
-          <w:bCs/>
-          <w:color w:val="000000"/>
-          <w:szCs w:val="28"/>
-          <w:lang w:eastAsia="ru-RU"/>
-        </w:rPr>
-      </w:pPr>
     </w:p>
     <w:p>
       <w:pPr>
@@ -4086,7 +4182,31 @@
         <w:t xml:space="preserve"> </w:t>
       </w:r>
       <w:r>
-        <w:t>возможности программного обеспечения Orange Data Mining. Освои</w:t>
+        <w:t xml:space="preserve">возможности программного обеспечения </w:t>
+      </w:r>
+      <w:proofErr w:type="spellStart"/>
+      <w:r>
+        <w:t>Orange</w:t>
+      </w:r>
+      <w:proofErr w:type="spellEnd"/>
+      <w:r>
+        <w:t xml:space="preserve"> </w:t>
+      </w:r>
+      <w:proofErr w:type="spellStart"/>
+      <w:r>
+        <w:t>Data</w:t>
+      </w:r>
+      <w:proofErr w:type="spellEnd"/>
+      <w:r>
+        <w:t xml:space="preserve"> </w:t>
+      </w:r>
+      <w:proofErr w:type="spellStart"/>
+      <w:r>
+        <w:t>Mining</w:t>
+      </w:r>
+      <w:proofErr w:type="spellEnd"/>
+      <w:r>
+        <w:t>. Освои</w:t>
       </w:r>
       <w:r>
         <w:t>л</w:t>
@@ -4985,7 +5105,7 @@
 </file>
 
 <file path=customXml/itemProps1.xml><?xml version="1.0" encoding="utf-8"?>
-<ds:datastoreItem xmlns:ds="http://schemas.openxmlformats.org/officeDocument/2006/customXml" ds:itemID="{E8FC829D-F9C9-4C3B-BE63-61EA556CB8F3}">
+<ds:datastoreItem xmlns:ds="http://schemas.openxmlformats.org/officeDocument/2006/customXml" ds:itemID="{7C3A2469-02F9-4739-93B4-C0672FAE60A5}">
   <ds:schemaRefs>
     <ds:schemaRef ds:uri="http://schemas.openxmlformats.org/officeDocument/2006/bibliography"/>
   </ds:schemaRefs>

</xml_diff>